<commit_message>
[auto] 预测更新 2026-06-19 03:21
</commit_message>
<xml_diff>
--- a/worldcup/reports/Scotland_vs_Morocco_20260619_0321.docx
+++ b/worldcup/reports/Scotland_vs_Morocco_20260619_0321.docx
@@ -93,7 +93,7 @@
           <w:b w:val="0"/>
           <w:sz w:val="18"/>
         </w:rPr>
-        <w:t>公平概率：55.1%  |  凯莉比例：0%  |  变异系数CV：2.12%  |  价值值：-0.2%</w:t>
+        <w:t>公平概率：55.0%  |  凯莉比例：0%  |  变异系数CV：2.13%  |  价值值：-0.4%</w:t>
       </w:r>
     </w:p>
     <w:p>
@@ -451,7 +451,7 @@
           <w:b w:val="0"/>
           <w:sz w:val="18"/>
         </w:rPr>
-        <w:t>✅ 概率一致性：预测概率55.1% vs 市场隐含概率57.5% — 偏差2.4%</w:t>
+        <w:t>✅ 概率一致性：预测概率55.0% vs 市场隐含概率57.5% — 偏差2.5%</w:t>
       </w:r>
     </w:p>
     <w:p>
@@ -464,7 +464,7 @@
           <w:b w:val="0"/>
           <w:sz w:val="18"/>
         </w:rPr>
-        <w:t>✅ 市场共识：高（CV=2.12%）</w:t>
+        <w:t>✅ 市场共识：高（CV=2.13%）</w:t>
       </w:r>
     </w:p>
     <w:p>

</xml_diff>